<commit_message>
fix(chung-tu): mẫu Phiếu đề xuất ghi CỨNG "năm 2026" ở dòng ký
Hồ sơ tiếp nhận năm 2016 in ra "Ngày … tháng … năm 2026". Hệ cũ đổ thẳng năm của hồ
sơ: cùng hồ sơ ấy in "năm 2016".

- thêm khoá "namHoSo", dùng lại đúng hàm lấy năm của bộ mẫu hệ cũ (oDauVanBan) chứ
  không dựng bản thứ hai
- hồ sơ di trú THIẾU ô năm thì in TRỐNG, không lùi về năm nay — lùi là bịa ra một năm
  không có ở đâu cả, và dòng ấy vẫn đọc trôi chảy nên không ai nhận ra
- vá cả hai chỗ trong mẫu

Bản mẫu TRÊN MÁY khác bản trong kho: nó có thêm hai hình vẽ (đường kẻ dưới tiêu đề) do
admin sửa. Nên không ghi đè từ kho mà vá đúng chỗ năm rồi tải lên lại; kiểm sau khi
tải: hết ghi cứng, 2 chỗ dùng {namHoSo}, 2 đường kẻ còn nguyên.

Co-Authored-By: Claude Opus 5 (1M context) <noreply@anthropic.com>
</commit_message>
<xml_diff>
--- a/backend/prisma/seed-assets/petition-docx/PHIEU_DE_XUAT.docx
+++ b/backend/prisma/seed-assets/petition-docx/PHIEU_DE_XUAT.docx
@@ -1738,7 +1738,7 @@
                 <w:iCs/>
                 <w:sz w:val="22"/>
               </w:rPr>
-              <w:t>Ngày … tháng … năm 2026</w:t>
+              <w:t>Ngày … tháng … năm {namHoSo}</w:t>
             </w:r>
             <w:r>
               <w:rPr>
@@ -1817,7 +1817,7 @@
                 <w:iCs/>
                 <w:sz w:val="22"/>
               </w:rPr>
-              <w:t>Ngày … tháng … năm 2026</w:t>
+              <w:t>Ngày … tháng … năm {namHoSo}</w:t>
             </w:r>
             <w:r>
               <w:rPr>

</xml_diff>

<commit_message>
fix(chung-tu): mẫu Phiếu đề xuất ghi CỨNG "năm 2026" ở dòng ký (#358)
Hồ sơ tiếp nhận năm 2016 in ra "Ngày … tháng … năm 2026". Hệ cũ đổ thẳng năm của hồ
sơ: cùng hồ sơ ấy in "năm 2016".

- thêm khoá "namHoSo", dùng lại đúng hàm lấy năm của bộ mẫu hệ cũ (oDauVanBan) chứ
  không dựng bản thứ hai
- hồ sơ di trú THIẾU ô năm thì in TRỐNG, không lùi về năm nay — lùi là bịa ra một năm
  không có ở đâu cả, và dòng ấy vẫn đọc trôi chảy nên không ai nhận ra
- vá cả hai chỗ trong mẫu

Bản mẫu TRÊN MÁY khác bản trong kho: nó có thêm hai hình vẽ (đường kẻ dưới tiêu đề) do
admin sửa. Nên không ghi đè từ kho mà vá đúng chỗ năm rồi tải lên lại; kiểm sau khi
tải: hết ghi cứng, 2 chỗ dùng {namHoSo}, 2 đường kẻ còn nguyên.

Co-authored-by: TRUNG-PC\Than Minh Trung <trungtm@aipower.vn>
Co-authored-by: Claude Opus 5 (1M context) <noreply@anthropic.com>
</commit_message>
<xml_diff>
--- a/backend/prisma/seed-assets/petition-docx/PHIEU_DE_XUAT.docx
+++ b/backend/prisma/seed-assets/petition-docx/PHIEU_DE_XUAT.docx
@@ -1738,7 +1738,7 @@
                 <w:iCs/>
                 <w:sz w:val="22"/>
               </w:rPr>
-              <w:t>Ngày … tháng … năm 2026</w:t>
+              <w:t>Ngày … tháng … năm {namHoSo}</w:t>
             </w:r>
             <w:r>
               <w:rPr>
@@ -1817,7 +1817,7 @@
                 <w:iCs/>
                 <w:sz w:val="22"/>
               </w:rPr>
-              <w:t>Ngày … tháng … năm 2026</w:t>
+              <w:t>Ngày … tháng … năm {namHoSo}</w:t>
             </w:r>
             <w:r>
               <w:rPr>

</xml_diff>

<commit_message>
fix(mau): Noi nhan xuong goc duoi ben trai theo the thuc hanh chinh
Nghi dinh 30/2020/ND-CP, Phu luc I: o so 9a "Noi nhan" nam o goc DUOI BEN TRAI
trang cuoi, ngang hoac thap hon khoi ky (o so 7).

Truoc: khoi nam o HANG DAU bang chu ky, tuc PHIA TREN ba khoi ky.
Sau  : khoi nam SAU bang chu ky, sat le trai, la thanh phan thap nhat.

Phieu de xuat co BA khoi ky (Phe duyet BCH / Pho doi truong / Can bo de xuat)
chiem het be ngang, nen khong dat canh nhau mot hang nhu Phieu chuyen don duoc.
Dat xuong duoi cung la cach dung the thuc nhat con lai.

Giu can TRAI va khong thut dau dong — cong khong-gian-chu-khi-xuong-dong canh
dieu nay: doan nhieu dong can deu se bi Word keo gian moi dong ket thuc bang
ngat dong mem.

469/469 vung document-templates xanh, XML hop le.

Co-Authored-By: Claude Opus 5 (1M context) <noreply@anthropic.com>
</commit_message>
<xml_diff>
--- a/backend/prisma/seed-assets/petition-docx/PHIEU_DE_XUAT.docx
+++ b/backend/prisma/seed-assets/petition-docx/PHIEU_DE_XUAT.docx
@@ -1620,109 +1620,6 @@
         <w:gridCol w:w="3113"/>
       </w:tblGrid>
       <w:tr>
-        <w:tc>
-          <w:tcPr>
-            <w:tcW w:w="4786" w:type="dxa"/>
-          </w:tcPr>
-          <w:p>
-            <w:pPr>
-              <w:spacing w:line="20" w:lineRule="atLeast"/>
-              <w:jc w:val="both"/>
-              <w:rPr>
-                <w:sz w:val="22"/>
-                <w:lang w:val="en-US"/>
-              </w:rPr>
-            </w:pPr>
-            <w:proofErr w:type="spellStart"/>
-            <w:r>
-              <w:rPr>
-                <w:b/>
-                <w:i/>
-                <w:sz w:val="24"/>
-                <w:lang w:val="en-US"/>
-              </w:rPr>
-              <w:t>Nơi</w:t>
-            </w:r>
-            <w:proofErr w:type="spellEnd"/>
-            <w:r>
-              <w:rPr>
-                <w:b/>
-                <w:i/>
-                <w:sz w:val="24"/>
-                <w:lang w:val="en-US"/>
-              </w:rPr>
-              <w:t xml:space="preserve"> </w:t>
-            </w:r>
-            <w:proofErr w:type="spellStart"/>
-            <w:r>
-              <w:rPr>
-                <w:b/>
-                <w:i/>
-                <w:sz w:val="24"/>
-                <w:lang w:val="en-US"/>
-              </w:rPr>
-              <w:t>nhận</w:t>
-            </w:r>
-            <w:proofErr w:type="spellEnd"/>
-            <w:r>
-              <w:rPr>
-                <w:b/>
-                <w:i/>
-                <w:sz w:val="24"/>
-                <w:lang w:val="en-US"/>
-              </w:rPr>
-              <w:t>:</w:t>
-            </w:r>
-            <w:r>
-              <w:rPr>
-                <w:sz w:val="22"/>
-                <w:lang w:val="en-US"/>
-              </w:rPr>
-              <w:t xml:space="preserve"> </w:t>
-            </w:r>
-          </w:p>
-          <w:p>
-            <w:pPr>
-              <w:jc w:val="left"/>
-              <w:rPr>
-                <w:sz w:val="22"/>
-                <w:lang w:val="en-US"/>
-              </w:rPr>
-            </w:pPr>
-            <w:r>
-              <w:rPr>
-                <w:sz w:val="22"/>
-                <w:lang w:val="en-US"/>
-              </w:rPr>
-              <w:t xml:space="preserve">{noiNhan}</w:t>
-            </w:r>
-          </w:p>
-          <w:p>
-            <w:pPr>
-              <w:spacing w:line="20" w:lineRule="atLeast"/>
-              <w:jc w:val="both"/>
-              <w:rPr>
-                <w:b/>
-                <w:lang w:val="en-US"/>
-              </w:rPr>
-            </w:pPr>
-          </w:p>
-        </w:tc>
-        <w:tc>
-          <w:tcPr>
-            <w:tcW w:w="5087" w:type="dxa"/>
-            <w:gridSpan w:val="2"/>
-          </w:tcPr>
-          <w:p>
-            <w:pPr>
-              <w:rPr>
-                <w:sz w:val="22"/>
-              </w:rPr>
-            </w:pPr>
-          </w:p>
-        </w:tc>
-      </w:tr>
-      <w:tr>
         <w:trPr>
           <w:trHeight w:val="1016"/>
         </w:trPr>
@@ -2132,6 +2029,39 @@
         </w:tc>
       </w:tr>
     </w:tbl>
+    <w:p>
+      <w:pPr>
+        <w:spacing w:before="120" w:line="20" w:lineRule="atLeast"/>
+        <w:jc w:val="left"/>
+        <w:rPr>
+          <w:b/>
+          <w:i/>
+          <w:sz w:val="24"/>
+        </w:rPr>
+      </w:pPr>
+      <w:r>
+        <w:rPr>
+          <w:b/>
+          <w:i/>
+          <w:sz w:val="24"/>
+        </w:rPr>
+        <w:t xml:space="preserve">Nơi nhận:</w:t>
+      </w:r>
+    </w:p>
+    <w:p>
+      <w:pPr>
+        <w:jc w:val="left"/>
+        <w:rPr>
+          <w:sz w:val="22"/>
+        </w:rPr>
+      </w:pPr>
+      <w:r>
+        <w:rPr>
+          <w:sz w:val="22"/>
+        </w:rPr>
+        <w:t xml:space="preserve">{noiNhan}</w:t>
+      </w:r>
+    </w:p>
     <w:p>
       <w:pPr>
         <w:spacing w:line="20" w:lineRule="atLeast"/>

</xml_diff>

<commit_message>
fix(mau): Noi nhan xuong goc duoi ben trai theo the thuc hanh chinh (#368)
Nghi dinh 30/2020/ND-CP, Phu luc I: o so 9a "Noi nhan" nam o goc DUOI BEN TRAI
trang cuoi, ngang hoac thap hon khoi ky (o so 7).

Truoc: khoi nam o HANG DAU bang chu ky, tuc PHIA TREN ba khoi ky.
Sau  : khoi nam SAU bang chu ky, sat le trai, la thanh phan thap nhat.

Phieu de xuat co BA khoi ky (Phe duyet BCH / Pho doi truong / Can bo de xuat)
chiem het be ngang, nen khong dat canh nhau mot hang nhu Phieu chuyen don duoc.
Dat xuong duoi cung la cach dung the thuc nhat con lai.

Giu can TRAI va khong thut dau dong — cong khong-gian-chu-khi-xuong-dong canh
dieu nay: doan nhieu dong can deu se bi Word keo gian moi dong ket thuc bang
ngat dong mem.

469/469 vung document-templates xanh, XML hop le.

Co-authored-by: TRUNG-PC\Than Minh Trung <trungtm@aipower.vn>
Co-authored-by: Claude Opus 5 (1M context) <noreply@anthropic.com>
</commit_message>
<xml_diff>
--- a/backend/prisma/seed-assets/petition-docx/PHIEU_DE_XUAT.docx
+++ b/backend/prisma/seed-assets/petition-docx/PHIEU_DE_XUAT.docx
@@ -1620,109 +1620,6 @@
         <w:gridCol w:w="3113"/>
       </w:tblGrid>
       <w:tr>
-        <w:tc>
-          <w:tcPr>
-            <w:tcW w:w="4786" w:type="dxa"/>
-          </w:tcPr>
-          <w:p>
-            <w:pPr>
-              <w:spacing w:line="20" w:lineRule="atLeast"/>
-              <w:jc w:val="both"/>
-              <w:rPr>
-                <w:sz w:val="22"/>
-                <w:lang w:val="en-US"/>
-              </w:rPr>
-            </w:pPr>
-            <w:proofErr w:type="spellStart"/>
-            <w:r>
-              <w:rPr>
-                <w:b/>
-                <w:i/>
-                <w:sz w:val="24"/>
-                <w:lang w:val="en-US"/>
-              </w:rPr>
-              <w:t>Nơi</w:t>
-            </w:r>
-            <w:proofErr w:type="spellEnd"/>
-            <w:r>
-              <w:rPr>
-                <w:b/>
-                <w:i/>
-                <w:sz w:val="24"/>
-                <w:lang w:val="en-US"/>
-              </w:rPr>
-              <w:t xml:space="preserve"> </w:t>
-            </w:r>
-            <w:proofErr w:type="spellStart"/>
-            <w:r>
-              <w:rPr>
-                <w:b/>
-                <w:i/>
-                <w:sz w:val="24"/>
-                <w:lang w:val="en-US"/>
-              </w:rPr>
-              <w:t>nhận</w:t>
-            </w:r>
-            <w:proofErr w:type="spellEnd"/>
-            <w:r>
-              <w:rPr>
-                <w:b/>
-                <w:i/>
-                <w:sz w:val="24"/>
-                <w:lang w:val="en-US"/>
-              </w:rPr>
-              <w:t>:</w:t>
-            </w:r>
-            <w:r>
-              <w:rPr>
-                <w:sz w:val="22"/>
-                <w:lang w:val="en-US"/>
-              </w:rPr>
-              <w:t xml:space="preserve"> </w:t>
-            </w:r>
-          </w:p>
-          <w:p>
-            <w:pPr>
-              <w:jc w:val="left"/>
-              <w:rPr>
-                <w:sz w:val="22"/>
-                <w:lang w:val="en-US"/>
-              </w:rPr>
-            </w:pPr>
-            <w:r>
-              <w:rPr>
-                <w:sz w:val="22"/>
-                <w:lang w:val="en-US"/>
-              </w:rPr>
-              <w:t xml:space="preserve">{noiNhan}</w:t>
-            </w:r>
-          </w:p>
-          <w:p>
-            <w:pPr>
-              <w:spacing w:line="20" w:lineRule="atLeast"/>
-              <w:jc w:val="both"/>
-              <w:rPr>
-                <w:b/>
-                <w:lang w:val="en-US"/>
-              </w:rPr>
-            </w:pPr>
-          </w:p>
-        </w:tc>
-        <w:tc>
-          <w:tcPr>
-            <w:tcW w:w="5087" w:type="dxa"/>
-            <w:gridSpan w:val="2"/>
-          </w:tcPr>
-          <w:p>
-            <w:pPr>
-              <w:rPr>
-                <w:sz w:val="22"/>
-              </w:rPr>
-            </w:pPr>
-          </w:p>
-        </w:tc>
-      </w:tr>
-      <w:tr>
         <w:trPr>
           <w:trHeight w:val="1016"/>
         </w:trPr>
@@ -2132,6 +2029,39 @@
         </w:tc>
       </w:tr>
     </w:tbl>
+    <w:p>
+      <w:pPr>
+        <w:spacing w:before="120" w:line="20" w:lineRule="atLeast"/>
+        <w:jc w:val="left"/>
+        <w:rPr>
+          <w:b/>
+          <w:i/>
+          <w:sz w:val="24"/>
+        </w:rPr>
+      </w:pPr>
+      <w:r>
+        <w:rPr>
+          <w:b/>
+          <w:i/>
+          <w:sz w:val="24"/>
+        </w:rPr>
+        <w:t xml:space="preserve">Nơi nhận:</w:t>
+      </w:r>
+    </w:p>
+    <w:p>
+      <w:pPr>
+        <w:jc w:val="left"/>
+        <w:rPr>
+          <w:sz w:val="22"/>
+        </w:rPr>
+      </w:pPr>
+      <w:r>
+        <w:rPr>
+          <w:sz w:val="22"/>
+        </w:rPr>
+        <w:t xml:space="preserve">{noiNhan}</w:t>
+      </w:r>
+    </w:p>
     <w:p>
       <w:pPr>
         <w:spacing w:line="20" w:lineRule="atLeast"/>

</xml_diff>

<commit_message>
fix(in-chung-tu): khối ký Phiếu đề xuất — viết hoa tên đội, tên cán bộ về đúng cột
Hai lỗi đo trên bản in thật 10/09/2026:

1. "PHÓ ĐỘI TRƯỞNG Đội 1" lệch kiểu chữ với ba chữ viết HOA bên cạnh. Mẫu hệ
   cũ (legacy-docx/don_thu_mau.docx) ghi cứng "PHÓ ĐỘI TRƯỞNG ĐỘI 1"; khi
   templatize, "ĐỘI 1" bị thay bằng {tenDoi} vốn trả về "Đội 1". Thêm biến
   {tenDoiHoa} thay vì đặt <w:caps/> trong mẫu: caps chỉ đổi cách hiển thị,
   chữ bóc ra khỏi tệp vẫn là "Đội 1" nên phép so bản in với hệ cũ ở tầng chữ
   sẽ báo lệch.

2. {tenCanBoDeXuat} nằm ở hàng 2 / ô 1 — tức dưới tiêu đề "PHÊ DUYỆT CỦA BAN
   CHỈ HUY PHÒNG". Chuyển về ô thứ ba của hàng 1, dưới "CÁN BỘ ĐỀ XUẤT" và
   ngang hàng với {tenPhoDoiTruong} (cùng đoạn thứ 8 của ô).

Ba ca kiểm mới trong ban-in-de-xuat-that.spec.ts đọc theo Ô chứ không theo
chữ: toContain('Phạm Thanh Văn') vẫn xanh khi tên nằm nhầm cột. Gieo lỗi bằng
tệp mẫu cũ: cả ba đỏ.

Co-Authored-By: Claude Opus 5 (1M context) <noreply@anthropic.com>
</commit_message>
<xml_diff>
--- a/backend/prisma/seed-assets/petition-docx/PHIEU_DE_XUAT.docx
+++ b/backend/prisma/seed-assets/petition-docx/PHIEU_DE_XUAT.docx
@@ -1771,7 +1771,7 @@
                 <w:szCs w:val="24"/>
                 <w:lang w:val="en-US"/>
               </w:rPr>
-              <w:t xml:space="preserve">PHÓ ĐỘI TRƯỞNG {tenDoi}</w:t>
+              <w:t xml:space="preserve">PHÓ ĐỘI TRƯỞNG {tenDoiHoa}</w:t>
             </w:r>
             <w:r>
               <w:rPr>
@@ -1974,6 +1974,23 @@
               </w:rPr>
             </w:pPr>
           </w:p>
+          <w:p>
+            <w:pPr>
+              <w:spacing w:line="20" w:lineRule="atLeast"/>
+              <w:jc w:val="center"/>
+              <w:rPr>
+                <w:b/>
+                <w:lang w:val="en-US"/>
+              </w:rPr>
+            </w:pPr>
+            <w:r>
+              <w:rPr>
+                <w:b/>
+                <w:lang w:val="en-US"/>
+              </w:rPr>
+              <w:t xml:space="preserve">{tenCanBoDeXuat}</w:t>
+            </w:r>
+          </w:p>
         </w:tc>
       </w:tr>
       <w:tr>
@@ -1992,9 +2009,6 @@
                 <w:sz w:val="24"/>
               </w:rPr>
             </w:pPr>
-            <w:r>
-              <w:t xml:space="preserve">{tenCanBoDeXuat}</w:t>
-            </w:r>
           </w:p>
         </w:tc>
         <w:tc>

</xml_diff>